<commit_message>
Apply methodist remarks: frozen-picture variant, «Два берега», everyday-life focus
Замечания В. Меркулова от 28.09.2026 (вечер): вариант «Застывшая картина» в
«Живых картинках»; блок «Два берега» в конце этапа «Мысль» — наглядное сравнение
среды зависти и среды радости за другого; акцент на выход в повседневный мир на
этапе «Осознание». Обновлены пособие, паспорт, обоснование, тетрадь, записка,
материалы курса и тексты этапов.

Co-Authored-By: Claude Fable 5.1 <noreply@anthropic.com>
Claude-Session: https://claude.ai/code/session_01GTSMQzCXFCg5K1V9ZHAnT6
</commit_message>
<xml_diff>
--- a/dist/mandarin/materials/passport.docx
+++ b/dist/mandarin/materials/passport.docx
@@ -7000,7 +7000,7 @@
                 <w:sz w:val="19"/>
                 <w:szCs w:val="19"/>
               </w:rPr>
-              <w:t xml:space="preserve">В парах: Тимофей (плечи опущены, взгляд в пол) и Кристина (спина прямая, подбородок вверх); поменяться ролями; финальная картинка — взяться за руки</w:t>
+              <w:t xml:space="preserve">В парах: Тимофей (плечи опущены, взгляд в пол) и Кристина (спина прямая, подбородок вверх); поменяться ролями; финальная картинка — взяться за руки. Вариант: двое желающих выбирают сцену и показывают героев застывшей картиной, силу чувств называют сами, класс отгадывает сцену и героев</w:t>
             </w:r>
           </w:p>
         </w:tc>
@@ -8634,6 +8634,89 @@
                 <w:sz w:val="19"/>
                 <w:szCs w:val="19"/>
               </w:rPr>
+              <w:t xml:space="preserve">«Два берега»</w:t>
+            </w:r>
+          </w:p>
+        </w:tc>
+        <w:tc>
+          <w:tcPr>
+            <w:tcW w:type="dxa" w:w="4819"/>
+            <w:tcMar>
+              <w:top w:type="dxa" w:w="60"/>
+              <w:left w:type="dxa" w:w="90"/>
+              <w:bottom w:type="dxa" w:w="60"/>
+              <w:right w:type="dxa" w:w="90"/>
+            </w:tcMar>
+          </w:tcPr>
+          <w:p>
+            <w:pPr>
+              <w:spacing w:after="0" w:line="259"/>
+            </w:pPr>
+            <w:r>
+              <w:rPr>
+                <w:rFonts w:ascii="Arial" w:cs="Arial" w:eastAsia="Arial" w:hAnsi="Arial"/>
+                <w:b w:val="false"/>
+                <w:bCs w:val="false"/>
+                <w:sz w:val="19"/>
+                <w:szCs w:val="19"/>
+              </w:rPr>
+              <w:t xml:space="preserve">Наглядно две среды: Лимонный берег — мучительные чувства и мысли зависти, Мандариновый берег — чувства и мысли радости за другого; карточки с предыдущих этапов раскладываются по берегам; класс выбирает разумом, куда причалит корабль</w:t>
+            </w:r>
+          </w:p>
+        </w:tc>
+        <w:tc>
+          <w:tcPr>
+            <w:tcW w:type="dxa" w:w="1542"/>
+            <w:tcMar>
+              <w:top w:type="dxa" w:w="60"/>
+              <w:left w:type="dxa" w:w="90"/>
+              <w:bottom w:type="dxa" w:w="60"/>
+              <w:right w:type="dxa" w:w="90"/>
+            </w:tcMar>
+          </w:tcPr>
+          <w:p>
+            <w:pPr>
+              <w:spacing w:after="0" w:line="259"/>
+            </w:pPr>
+            <w:r>
+              <w:rPr>
+                <w:rFonts w:ascii="Arial" w:cs="Arial" w:eastAsia="Arial" w:hAnsi="Arial"/>
+                <w:b w:val="false"/>
+                <w:bCs w:val="false"/>
+                <w:sz w:val="19"/>
+                <w:szCs w:val="19"/>
+              </w:rPr>
+              <w:t xml:space="preserve">3 мин</w:t>
+            </w:r>
+          </w:p>
+        </w:tc>
+      </w:tr>
+      <w:tr>
+        <w:trPr>
+          <w:tblHeader w:val="false"/>
+        </w:trPr>
+        <w:tc>
+          <w:tcPr>
+            <w:tcW w:type="dxa" w:w="3277"/>
+            <w:tcMar>
+              <w:top w:type="dxa" w:w="60"/>
+              <w:left w:type="dxa" w:w="90"/>
+              <w:bottom w:type="dxa" w:w="60"/>
+              <w:right w:type="dxa" w:w="90"/>
+            </w:tcMar>
+          </w:tcPr>
+          <w:p>
+            <w:pPr>
+              <w:spacing w:after="0" w:line="259"/>
+            </w:pPr>
+            <w:r>
+              <w:rPr>
+                <w:rFonts w:ascii="Arial" w:cs="Arial" w:eastAsia="Arial" w:hAnsi="Arial"/>
+                <w:b w:val="false"/>
+                <w:bCs w:val="false"/>
+                <w:sz w:val="19"/>
+                <w:szCs w:val="19"/>
+              </w:rPr>
               <w:t xml:space="preserve">Самодиагностика и трюизм</w:t>
             </w:r>
           </w:p>
@@ -8889,6 +8972,19 @@
           <w:szCs w:val="21"/>
         </w:rPr>
         <w:t xml:space="preserve">Педагогическая цель: перенести опыт на свою жизнь; освоить «антидот зависти»; заключить «Договор с собой».</w:t>
+      </w:r>
+    </w:p>
+    <w:p>
+      <w:pPr>
+        <w:spacing w:after="120" w:line="276"/>
+      </w:pPr>
+      <w:r>
+        <w:rPr>
+          <w:rFonts w:ascii="Arial" w:cs="Arial" w:eastAsia="Arial" w:hAnsi="Arial"/>
+          <w:sz w:val="21"/>
+          <w:szCs w:val="21"/>
+        </w:rPr>
+        <w:t xml:space="preserve">Этап — выход из фильма в повседневный мир: теория предыдущих этапов проверяется примерами из жизни детей.</w:t>
       </w:r>
     </w:p>
     <w:p>
@@ -16725,7 +16821,7 @@
                 <w:sz w:val="19"/>
                 <w:szCs w:val="19"/>
               </w:rPr>
-              <w:t xml:space="preserve">Тетрадь: задания 6 (корабль), 8 (мандарин и лимон)</w:t>
+              <w:t xml:space="preserve">Тетрадь: задания 6 (корабль), 8 (мандарин и лимон), «Два берега»; карточки чувств и мыслей</w:t>
             </w:r>
           </w:p>
         </w:tc>

</xml_diff>

<commit_message>
Correct the object of envy in «Антидот зависти» per methodist remark
Кристина завидовала не вещам, а дружбе Насти и Тимофея — их хорошим качествам;
плохие качества завидовали хорошим. Примеры диверсии и антидота заменены в пособии,
паспорте, обосновании, тетради, записке и текстах курса.

Co-Authored-By: Claude Fable 5.1 <noreply@anthropic.com>
Claude-Session: https://claude.ai/code/session_01GTSMQzCXFCg5K1V9ZHAnT6
</commit_message>
<xml_diff>
--- a/dist/mandarin/materials/passport.docx
+++ b/dist/mandarin/materials/passport.docx
@@ -9874,7 +9874,7 @@
                 <w:sz w:val="19"/>
                 <w:szCs w:val="19"/>
               </w:rPr>
-              <w:t xml:space="preserve">Пример из фильма: «У меня всё есть, а у тебя даже телефон кнопочный»; «Этот мусор мне мешал»</w:t>
+              <w:t xml:space="preserve">Пример из фильма: «Почему они дружат, а я одна? Пусть у них ничего не получится»; «Это мусор. Он мне мешал». Кристина завидовала не вещам, а дружбе Насти и Тимофея — их хорошим качествам</w:t>
             </w:r>
           </w:p>
         </w:tc>
@@ -9931,7 +9931,7 @@
                 <w:sz w:val="19"/>
                 <w:szCs w:val="19"/>
               </w:rPr>
-              <w:t xml:space="preserve">Пример из фильма: «Она умеет придумывать!»; «Просто он лежал такой грустный. Как ты…»</w:t>
+              <w:t xml:space="preserve">Пример из фильма: «Она умеет придумывать!»; «Просто он лежал такой грустный. Как ты…»; антидот Кристины — новый капитан для друзей</w:t>
             </w:r>
           </w:p>
         </w:tc>

</xml_diff>

<commit_message>
Mandarin: replace published materials with v8.1 DOCX/PDF
</commit_message>
<xml_diff>
--- a/dist/mandarin/materials/passport.docx
+++ b/dist/mandarin/materials/passport.docx
@@ -746,7 +746,7 @@
                 <w:sz w:val="19"/>
                 <w:szCs w:val="19"/>
               </w:rPr>
-              <w:t xml:space="preserve">День киноурока (этапы 1–6, с просмотром фильма) — около 85 минут, удобно в два урока; этап 7 «Воодушевление — Праздник успехов» — 30 минут после выполнения общего дела класса</w:t>
+              <w:t>День киноурока (этапы 1–6, с просмотром фильма) — около 85 минут, удобно в два урока; этап 7 «Социальная практика» — выполнение общего дела класса; этап 8 «Воодушевление — Праздник успехов» — 30 минут после выполнения дела</w:t>
             </w:r>
           </w:p>
         </w:tc>
@@ -1375,7 +1375,7 @@
                 <w:sz w:val="19"/>
                 <w:szCs w:val="19"/>
               </w:rPr>
-              <w:t xml:space="preserve">Воодушевление</w:t>
+              <w:t>Социальная практика</w:t>
             </w:r>
           </w:p>
         </w:tc>
@@ -1401,7 +1401,64 @@
                 <w:sz w:val="19"/>
                 <w:szCs w:val="19"/>
               </w:rPr>
-              <w:t xml:space="preserve">После выполнения общего дела провести «Праздник успехов»: «Лучик в ладошках», «Цветок чувств», «Сад», Аллея рекордов радости за другого, рефлексия, Точка Б, «Семена радости»; закрыть цикл реальным поступком</w:t>
+              <w:t>Выполнить выбранное общее дело класса и получить реальный опыт созидательного действия для других</w:t>
+            </w:r>
+          </w:p>
+        </w:tc>
+      </w:tr>
+      <w:tr>
+        <w:trPr>
+          <w:tblHeader w:val="false"/>
+        </w:trPr>
+        <w:tc>
+          <w:tcPr>
+            <w:tcW w:type="dxa" w:w="2120"/>
+            <w:tcMar>
+              <w:top w:type="dxa" w:w="60"/>
+              <w:left w:type="dxa" w:w="90"/>
+              <w:bottom w:type="dxa" w:w="60"/>
+              <w:right w:type="dxa" w:w="90"/>
+            </w:tcMar>
+          </w:tcPr>
+          <w:p>
+            <w:pPr>
+              <w:spacing w:after="0" w:line="259"/>
+            </w:pPr>
+            <w:r>
+              <w:rPr>
+                <w:rFonts w:ascii="Arial" w:cs="Arial" w:eastAsia="Arial" w:hAnsi="Arial"/>
+                <w:b w:val="false"/>
+                <w:bCs w:val="false"/>
+                <w:sz w:val="19"/>
+                <w:szCs w:val="19"/>
+              </w:rPr>
+              <w:t>Воодушевление</w:t>
+            </w:r>
+          </w:p>
+        </w:tc>
+        <w:tc>
+          <w:tcPr>
+            <w:tcW w:type="dxa" w:w="7518"/>
+            <w:tcMar>
+              <w:top w:type="dxa" w:w="60"/>
+              <w:left w:type="dxa" w:w="90"/>
+              <w:bottom w:type="dxa" w:w="60"/>
+              <w:right w:type="dxa" w:w="90"/>
+            </w:tcMar>
+          </w:tcPr>
+          <w:p>
+            <w:pPr>
+              <w:spacing w:after="0" w:line="259"/>
+            </w:pPr>
+            <w:r>
+              <w:rPr>
+                <w:rFonts w:ascii="Arial" w:cs="Arial" w:eastAsia="Arial" w:hAnsi="Arial"/>
+                <w:b w:val="false"/>
+                <w:bCs w:val="false"/>
+                <w:sz w:val="19"/>
+                <w:szCs w:val="19"/>
+              </w:rPr>
+              <w:t>После выполнения общего дела провести «Праздник успехов»: «Лучик в ладошках», «Цветок чувств», «Сад», Аллея рекордов, рефлексия, Точка Б, «Семена радости»</w:t>
             </w:r>
           </w:p>
         </w:tc>
@@ -2386,6 +2443,89 @@
                 <w:sz w:val="19"/>
                 <w:szCs w:val="19"/>
               </w:rPr>
+              <w:t xml:space="preserve">Социальная практика</w:t>
+            </w:r>
+          </w:p>
+        </w:tc>
+        <w:tc>
+          <w:tcPr>
+            <w:tcW w:type="dxa" w:w="6554"/>
+            <w:tcMar>
+              <w:top w:type="dxa" w:w="60"/>
+              <w:left w:type="dxa" w:w="90"/>
+              <w:bottom w:type="dxa" w:w="60"/>
+              <w:right w:type="dxa" w:w="90"/>
+            </w:tcMar>
+          </w:tcPr>
+          <w:p>
+            <w:pPr>
+              <w:spacing w:after="0" w:line="259"/>
+            </w:pPr>
+            <w:r>
+              <w:rPr>
+                <w:rFonts w:ascii="Arial" w:cs="Arial" w:eastAsia="Arial" w:hAnsi="Arial"/>
+                <w:b w:val="false"/>
+                <w:bCs w:val="false"/>
+                <w:sz w:val="19"/>
+                <w:szCs w:val="19"/>
+              </w:rPr>
+              <w:t xml:space="preserve">Выполнение выбранного общего дела класса: подготовка по Паспорту общего дела, выполнение, результат для получателя</w:t>
+            </w:r>
+          </w:p>
+        </w:tc>
+      </w:tr>
+      <w:tr>
+        <w:trPr>
+          <w:tblHeader w:val="false"/>
+        </w:trPr>
+        <w:tc>
+          <w:tcPr>
+            <w:tcW w:type="dxa" w:w="771"/>
+            <w:tcMar>
+              <w:top w:type="dxa" w:w="60"/>
+              <w:left w:type="dxa" w:w="90"/>
+              <w:bottom w:type="dxa" w:w="60"/>
+              <w:right w:type="dxa" w:w="90"/>
+            </w:tcMar>
+          </w:tcPr>
+          <w:p>
+            <w:pPr>
+              <w:spacing w:after="0" w:line="259"/>
+            </w:pPr>
+            <w:r>
+              <w:rPr>
+                <w:rFonts w:ascii="Arial" w:cs="Arial" w:eastAsia="Arial" w:hAnsi="Arial"/>
+                <w:b w:val="false"/>
+                <w:bCs w:val="false"/>
+                <w:sz w:val="19"/>
+                <w:szCs w:val="19"/>
+              </w:rPr>
+              <w:t xml:space="preserve">8</w:t>
+            </w:r>
+          </w:p>
+        </w:tc>
+        <w:tc>
+          <w:tcPr>
+            <w:tcW w:type="dxa" w:w="2313"/>
+            <w:tcMar>
+              <w:top w:type="dxa" w:w="60"/>
+              <w:left w:type="dxa" w:w="90"/>
+              <w:bottom w:type="dxa" w:w="60"/>
+              <w:right w:type="dxa" w:w="90"/>
+            </w:tcMar>
+          </w:tcPr>
+          <w:p>
+            <w:pPr>
+              <w:spacing w:after="0" w:line="259"/>
+            </w:pPr>
+            <w:r>
+              <w:rPr>
+                <w:rFonts w:ascii="Arial" w:cs="Arial" w:eastAsia="Arial" w:hAnsi="Arial"/>
+                <w:b w:val="false"/>
+                <w:bCs w:val="false"/>
+                <w:sz w:val="19"/>
+                <w:szCs w:val="19"/>
+              </w:rPr>
               <w:t xml:space="preserve">Воодушевление</w:t>
             </w:r>
           </w:p>
@@ -3313,7 +3453,7 @@
                 <w:sz w:val="19"/>
                 <w:szCs w:val="19"/>
               </w:rPr>
-              <w:t xml:space="preserve">Воображение, Воодушевление</w:t>
+              <w:t>Воображение → Социальная практика</w:t>
             </w:r>
           </w:p>
         </w:tc>
@@ -4285,7 +4425,7 @@
                 <w:sz w:val="19"/>
                 <w:szCs w:val="19"/>
               </w:rPr>
-              <w:t xml:space="preserve">7 последовательных этапов с единой метафорой и диагностикой; шесть — в день киноурока, седьмой — после реального дела</w:t>
+              <w:t>8 последовательных этапов с единой метафорой и диагностикой; шесть — в день киноурока, седьмой — реальное общее дело, восьмой — после дела</w:t>
             </w:r>
           </w:p>
         </w:tc>
@@ -7000,7 +7140,7 @@
                 <w:sz w:val="19"/>
                 <w:szCs w:val="19"/>
               </w:rPr>
-              <w:t xml:space="preserve">В парах: Тимофей (плечи опущены, взгляд в пол) и Кристина (спина прямая, подбородок вверх); поменяться ролями; финальная картинка — взяться за руки. Вариант: двое желающих выбирают сцену и показывают героев застывшей картиной, силу чувств называют сами, класс отгадывает сцену и героев</w:t>
+              <w:t xml:space="preserve">В парах: Тимофей (плечи опущены, взгляд в пол) и Кристина (спина прямая, подбородок вверх); поменяться ролями; финальная картинка — взяться за руки</w:t>
             </w:r>
           </w:p>
         </w:tc>
@@ -8578,89 +8718,6 @@
                 <w:szCs w:val="19"/>
               </w:rPr>
               <w:t xml:space="preserve">Ситуации на рисунках: о радости за другого или о зависти? Закрасить нужный фрукт; обосновать деталью рисунка</w:t>
-            </w:r>
-          </w:p>
-        </w:tc>
-        <w:tc>
-          <w:tcPr>
-            <w:tcW w:type="dxa" w:w="1542"/>
-            <w:tcMar>
-              <w:top w:type="dxa" w:w="60"/>
-              <w:left w:type="dxa" w:w="90"/>
-              <w:bottom w:type="dxa" w:w="60"/>
-              <w:right w:type="dxa" w:w="90"/>
-            </w:tcMar>
-          </w:tcPr>
-          <w:p>
-            <w:pPr>
-              <w:spacing w:after="0" w:line="259"/>
-            </w:pPr>
-            <w:r>
-              <w:rPr>
-                <w:rFonts w:ascii="Arial" w:cs="Arial" w:eastAsia="Arial" w:hAnsi="Arial"/>
-                <w:b w:val="false"/>
-                <w:bCs w:val="false"/>
-                <w:sz w:val="19"/>
-                <w:szCs w:val="19"/>
-              </w:rPr>
-              <w:t xml:space="preserve">3 мин</w:t>
-            </w:r>
-          </w:p>
-        </w:tc>
-      </w:tr>
-      <w:tr>
-        <w:trPr>
-          <w:tblHeader w:val="false"/>
-        </w:trPr>
-        <w:tc>
-          <w:tcPr>
-            <w:tcW w:type="dxa" w:w="3277"/>
-            <w:tcMar>
-              <w:top w:type="dxa" w:w="60"/>
-              <w:left w:type="dxa" w:w="90"/>
-              <w:bottom w:type="dxa" w:w="60"/>
-              <w:right w:type="dxa" w:w="90"/>
-            </w:tcMar>
-          </w:tcPr>
-          <w:p>
-            <w:pPr>
-              <w:spacing w:after="0" w:line="259"/>
-            </w:pPr>
-            <w:r>
-              <w:rPr>
-                <w:rFonts w:ascii="Arial" w:cs="Arial" w:eastAsia="Arial" w:hAnsi="Arial"/>
-                <w:b w:val="false"/>
-                <w:bCs w:val="false"/>
-                <w:sz w:val="19"/>
-                <w:szCs w:val="19"/>
-              </w:rPr>
-              <w:t xml:space="preserve">«Два берега»</w:t>
-            </w:r>
-          </w:p>
-        </w:tc>
-        <w:tc>
-          <w:tcPr>
-            <w:tcW w:type="dxa" w:w="4819"/>
-            <w:tcMar>
-              <w:top w:type="dxa" w:w="60"/>
-              <w:left w:type="dxa" w:w="90"/>
-              <w:bottom w:type="dxa" w:w="60"/>
-              <w:right w:type="dxa" w:w="90"/>
-            </w:tcMar>
-          </w:tcPr>
-          <w:p>
-            <w:pPr>
-              <w:spacing w:after="0" w:line="259"/>
-            </w:pPr>
-            <w:r>
-              <w:rPr>
-                <w:rFonts w:ascii="Arial" w:cs="Arial" w:eastAsia="Arial" w:hAnsi="Arial"/>
-                <w:b w:val="false"/>
-                <w:bCs w:val="false"/>
-                <w:sz w:val="19"/>
-                <w:szCs w:val="19"/>
-              </w:rPr>
-              <w:t xml:space="preserve">Наглядно две среды: Лимонный берег — мучительные чувства и мысли зависти, Мандариновый берег — чувства и мысли радости за другого; карточки с предыдущих этапов раскладываются по берегам; класс выбирает разумом, куда причалит корабль</w:t>
             </w:r>
           </w:p>
         </w:tc>
@@ -8984,19 +9041,6 @@
           <w:sz w:val="21"/>
           <w:szCs w:val="21"/>
         </w:rPr>
-        <w:t xml:space="preserve">Этап — выход из фильма в повседневный мир: теория предыдущих этапов проверяется примерами из жизни детей.</w:t>
-      </w:r>
-    </w:p>
-    <w:p>
-      <w:pPr>
-        <w:spacing w:after="120" w:line="276"/>
-      </w:pPr>
-      <w:r>
-        <w:rPr>
-          <w:rFonts w:ascii="Arial" w:cs="Arial" w:eastAsia="Arial" w:hAnsi="Arial"/>
-          <w:sz w:val="21"/>
-          <w:szCs w:val="21"/>
-        </w:rPr>
         <w:t xml:space="preserve">Формула этапа: Метафора → Активность → Самодиагностика → Трюизм → Мостик.</w:t>
       </w:r>
     </w:p>
@@ -9874,7 +9918,7 @@
                 <w:sz w:val="19"/>
                 <w:szCs w:val="19"/>
               </w:rPr>
-              <w:t xml:space="preserve">Пример из фильма: «Почему они дружат, а я одна? Пусть у них ничего не получится»; «Это мусор. Он мне мешал». Кристина завидовала не вещам, а дружбе Насти и Тимофея — их хорошим качествам</w:t>
+              <w:t xml:space="preserve">Пример из фильма: «У меня всё есть, а у тебя даже телефон кнопочный»; «Этот мусор мне мешал»</w:t>
             </w:r>
           </w:p>
         </w:tc>
@@ -9931,7 +9975,7 @@
                 <w:sz w:val="19"/>
                 <w:szCs w:val="19"/>
               </w:rPr>
-              <w:t xml:space="preserve">Пример из фильма: «Она умеет придумывать!»; «Просто он лежал такой грустный. Как ты…»; антидот Кристины — новый капитан для друзей</w:t>
+              <w:t xml:space="preserve">Пример из фильма: «Она умеет придумывать!»; «Просто он лежал такой грустный. Как ты…»</w:t>
             </w:r>
           </w:p>
         </w:tc>
@@ -11350,7 +11394,343 @@
           <w:sz w:val="24"/>
           <w:szCs w:val="24"/>
         </w:rPr>
-        <w:t xml:space="preserve">5.7. ЭТАП 7: ВООДУШЕВЛЕНИЕ — ПРАЗДНИК УСПЕХОВ (после общего дела, 30 мин)</w:t>
+        <w:t xml:space="preserve">5.7. ЭТАП 7: СОЦИАЛЬНАЯ ПРАКТИКА — ОБЩЕЕ ДЕЛО КЛАССА</w:t>
+      </w:r>
+    </w:p>
+    <w:p>
+      <w:pPr>
+        <w:spacing w:after="120" w:line="276"/>
+      </w:pPr>
+      <w:r>
+        <w:rPr>
+          <w:rFonts w:ascii="Arial" w:cs="Arial" w:eastAsia="Arial" w:hAnsi="Arial"/>
+          <w:sz w:val="21"/>
+          <w:szCs w:val="21"/>
+        </w:rPr>
+        <w:t xml:space="preserve">Педагогическая цель: выполнить выбранное на этапе «Воображение» общее дело класса и перевести замысел в реальный поступок, направленный на пользу другим.</w:t>
+      </w:r>
+    </w:p>
+    <w:p>
+      <w:pPr>
+        <w:spacing w:after="120" w:line="276"/>
+      </w:pPr>
+      <w:r>
+        <w:rPr>
+          <w:rFonts w:ascii="Arial" w:cs="Arial" w:eastAsia="Arial" w:hAnsi="Arial"/>
+          <w:sz w:val="21"/>
+          <w:szCs w:val="21"/>
+        </w:rPr>
+        <w:t xml:space="preserve">Формула этапа: Паспорт общего дела → Подготовка → Выполнение → Результат для получателя. Этап считается пройденным только после фактического действия; обсуждение плана не заменяет социальную практику.</w:t>
+      </w:r>
+    </w:p>
+    <w:p>
+      <w:pPr>
+        <w:spacing w:after="120" w:line="276"/>
+      </w:pPr>
+      <w:r>
+        <w:rPr>
+          <w:rFonts w:ascii="Arial" w:cs="Arial" w:eastAsia="Arial" w:hAnsi="Arial"/>
+          <w:sz w:val="21"/>
+          <w:szCs w:val="21"/>
+        </w:rPr>
+        <w:t xml:space="preserve">Ход этапа:</w:t>
+      </w:r>
+    </w:p>
+    <w:tbl>
+      <w:tblPr>
+        <w:tblW w:type="dxa" w:w="9638"/>
+        <w:tblBorders>
+          <w:top w:val="single" w:color="9FB0C3" w:sz="4"/>
+          <w:left w:val="single" w:color="9FB0C3" w:sz="4"/>
+          <w:bottom w:val="single" w:color="9FB0C3" w:sz="4"/>
+          <w:right w:val="single" w:color="9FB0C3" w:sz="4"/>
+          <w:insideH w:val="single" w:color="C9D3DE" w:sz="4"/>
+          <w:insideV w:val="single" w:color="C9D3DE" w:sz="4"/>
+        </w:tblBorders>
+      </w:tblPr>
+      <w:tblGrid>
+        <w:gridCol w:w="3277"/>
+        <w:gridCol w:w="6361"/>
+      </w:tblGrid>
+      <w:tr>
+        <w:trPr>
+          <w:tblHeader/>
+        </w:trPr>
+        <w:tc>
+          <w:tcPr>
+            <w:tcW w:type="dxa" w:w="3277"/>
+            <w:shd w:fill="DCE3EC" w:color="auto" w:val="clear"/>
+            <w:tcMar>
+              <w:top w:type="dxa" w:w="60"/>
+              <w:left w:type="dxa" w:w="90"/>
+              <w:bottom w:type="dxa" w:w="60"/>
+              <w:right w:type="dxa" w:w="90"/>
+            </w:tcMar>
+          </w:tcPr>
+          <w:p>
+            <w:pPr>
+              <w:spacing w:after="0" w:line="259"/>
+            </w:pPr>
+            <w:r>
+              <w:rPr>
+                <w:rFonts w:ascii="Arial" w:cs="Arial" w:eastAsia="Arial" w:hAnsi="Arial"/>
+                <w:b/>
+                <w:bCs/>
+                <w:sz w:val="19"/>
+                <w:szCs w:val="19"/>
+              </w:rPr>
+              <w:t xml:space="preserve">Шаг</w:t>
+            </w:r>
+          </w:p>
+        </w:tc>
+        <w:tc>
+          <w:tcPr>
+            <w:tcW w:type="dxa" w:w="6361"/>
+            <w:shd w:fill="DCE3EC" w:color="auto" w:val="clear"/>
+            <w:tcMar>
+              <w:top w:type="dxa" w:w="60"/>
+              <w:left w:type="dxa" w:w="90"/>
+              <w:bottom w:type="dxa" w:w="60"/>
+              <w:right w:type="dxa" w:w="90"/>
+            </w:tcMar>
+          </w:tcPr>
+          <w:p>
+            <w:pPr>
+              <w:spacing w:after="0" w:line="259"/>
+            </w:pPr>
+            <w:r>
+              <w:rPr>
+                <w:rFonts w:ascii="Arial" w:cs="Arial" w:eastAsia="Arial" w:hAnsi="Arial"/>
+                <w:b/>
+                <w:bCs/>
+                <w:sz w:val="19"/>
+                <w:szCs w:val="19"/>
+              </w:rPr>
+              <w:t xml:space="preserve">Содержание</w:t>
+            </w:r>
+          </w:p>
+        </w:tc>
+      </w:tr>
+      <w:tr>
+        <w:trPr>
+          <w:tblHeader w:val="false"/>
+        </w:trPr>
+        <w:tc>
+          <w:tcPr>
+            <w:tcW w:type="dxa" w:w="3277"/>
+            <w:tcMar>
+              <w:top w:type="dxa" w:w="60"/>
+              <w:left w:type="dxa" w:w="90"/>
+              <w:bottom w:type="dxa" w:w="60"/>
+              <w:right w:type="dxa" w:w="90"/>
+            </w:tcMar>
+          </w:tcPr>
+          <w:p>
+            <w:pPr>
+              <w:spacing w:after="0" w:line="259"/>
+            </w:pPr>
+            <w:r>
+              <w:rPr>
+                <w:rFonts w:ascii="Arial" w:cs="Arial" w:eastAsia="Arial" w:hAnsi="Arial"/>
+                <w:b w:val="false"/>
+                <w:bCs w:val="false"/>
+                <w:sz w:val="19"/>
+                <w:szCs w:val="19"/>
+              </w:rPr>
+              <w:t xml:space="preserve">Подготовка</w:t>
+            </w:r>
+          </w:p>
+        </w:tc>
+        <w:tc>
+          <w:tcPr>
+            <w:tcW w:type="dxa" w:w="6361"/>
+            <w:tcMar>
+              <w:top w:type="dxa" w:w="60"/>
+              <w:left w:type="dxa" w:w="90"/>
+              <w:bottom w:type="dxa" w:w="60"/>
+              <w:right w:type="dxa" w:w="90"/>
+            </w:tcMar>
+          </w:tcPr>
+          <w:p>
+            <w:pPr>
+              <w:spacing w:after="0" w:line="259"/>
+            </w:pPr>
+            <w:r>
+              <w:rPr>
+                <w:rFonts w:ascii="Arial" w:cs="Arial" w:eastAsia="Arial" w:hAnsi="Arial"/>
+                <w:b w:val="false"/>
+                <w:bCs w:val="false"/>
+                <w:sz w:val="19"/>
+                <w:szCs w:val="19"/>
+              </w:rPr>
+              <w:t xml:space="preserve">Проверка Паспорта общего дела: получатель, потребность, роли, материалы, помощь взрослых, срок</w:t>
+            </w:r>
+          </w:p>
+        </w:tc>
+      </w:tr>
+      <w:tr>
+        <w:trPr>
+          <w:tblHeader w:val="false"/>
+        </w:trPr>
+        <w:tc>
+          <w:tcPr>
+            <w:tcW w:type="dxa" w:w="3277"/>
+            <w:tcMar>
+              <w:top w:type="dxa" w:w="60"/>
+              <w:left w:type="dxa" w:w="90"/>
+              <w:bottom w:type="dxa" w:w="60"/>
+              <w:right w:type="dxa" w:w="90"/>
+            </w:tcMar>
+          </w:tcPr>
+          <w:p>
+            <w:pPr>
+              <w:spacing w:after="0" w:line="259"/>
+            </w:pPr>
+            <w:r>
+              <w:rPr>
+                <w:rFonts w:ascii="Arial" w:cs="Arial" w:eastAsia="Arial" w:hAnsi="Arial"/>
+                <w:b w:val="false"/>
+                <w:bCs w:val="false"/>
+                <w:sz w:val="19"/>
+                <w:szCs w:val="19"/>
+              </w:rPr>
+              <w:t xml:space="preserve">Выполнение</w:t>
+            </w:r>
+          </w:p>
+        </w:tc>
+        <w:tc>
+          <w:tcPr>
+            <w:tcW w:type="dxa" w:w="6361"/>
+            <w:tcMar>
+              <w:top w:type="dxa" w:w="60"/>
+              <w:left w:type="dxa" w:w="90"/>
+              <w:bottom w:type="dxa" w:w="60"/>
+              <w:right w:type="dxa" w:w="90"/>
+            </w:tcMar>
+          </w:tcPr>
+          <w:p>
+            <w:pPr>
+              <w:spacing w:after="0" w:line="259"/>
+            </w:pPr>
+            <w:r>
+              <w:rPr>
+                <w:rFonts w:ascii="Arial" w:cs="Arial" w:eastAsia="Arial" w:hAnsi="Arial"/>
+                <w:b w:val="false"/>
+                <w:bCs w:val="false"/>
+                <w:sz w:val="19"/>
+                <w:szCs w:val="19"/>
+              </w:rPr>
+              <w:t xml:space="preserve">Каждая команда делает свою часть; педагог называет вслух проявления трёх парусов</w:t>
+            </w:r>
+          </w:p>
+        </w:tc>
+      </w:tr>
+      <w:tr>
+        <w:trPr>
+          <w:tblHeader w:val="false"/>
+        </w:trPr>
+        <w:tc>
+          <w:tcPr>
+            <w:tcW w:type="dxa" w:w="3277"/>
+            <w:tcMar>
+              <w:top w:type="dxa" w:w="60"/>
+              <w:left w:type="dxa" w:w="90"/>
+              <w:bottom w:type="dxa" w:w="60"/>
+              <w:right w:type="dxa" w:w="90"/>
+            </w:tcMar>
+          </w:tcPr>
+          <w:p>
+            <w:pPr>
+              <w:spacing w:after="0" w:line="259"/>
+            </w:pPr>
+            <w:r>
+              <w:rPr>
+                <w:rFonts w:ascii="Arial" w:cs="Arial" w:eastAsia="Arial" w:hAnsi="Arial"/>
+                <w:b w:val="false"/>
+                <w:bCs w:val="false"/>
+                <w:sz w:val="19"/>
+                <w:szCs w:val="19"/>
+              </w:rPr>
+              <w:t xml:space="preserve">Результат для получателя</w:t>
+            </w:r>
+          </w:p>
+        </w:tc>
+        <w:tc>
+          <w:tcPr>
+            <w:tcW w:type="dxa" w:w="6361"/>
+            <w:tcMar>
+              <w:top w:type="dxa" w:w="60"/>
+              <w:left w:type="dxa" w:w="90"/>
+              <w:bottom w:type="dxa" w:w="60"/>
+              <w:right w:type="dxa" w:w="90"/>
+            </w:tcMar>
+          </w:tcPr>
+          <w:p>
+            <w:pPr>
+              <w:spacing w:after="0" w:line="259"/>
+            </w:pPr>
+            <w:r>
+              <w:rPr>
+                <w:rFonts w:ascii="Arial" w:cs="Arial" w:eastAsia="Arial" w:hAnsi="Arial"/>
+                <w:b w:val="false"/>
+                <w:bCs w:val="false"/>
+                <w:sz w:val="19"/>
+                <w:szCs w:val="19"/>
+              </w:rPr>
+              <w:t xml:space="preserve">Класс передаёт результат получателю и видит его реакцию — плод дела</w:t>
+            </w:r>
+          </w:p>
+        </w:tc>
+      </w:tr>
+    </w:tbl>
+    <w:p>
+      <w:pPr>
+        <w:spacing w:after="120" w:line="276"/>
+      </w:pPr>
+      <w:r>
+        <w:rPr>
+          <w:rFonts w:ascii="Arial" w:cs="Arial" w:eastAsia="Arial" w:hAnsi="Arial"/>
+          <w:sz w:val="21"/>
+          <w:szCs w:val="21"/>
+        </w:rPr>
+        <w:t xml:space="preserve">Методический секрет: во время дела педагог замечает и называет вслух проявления трёх парусов: «Вот доброжелательность — ты помог соседней команде», «Вот чуткость — ты заметил, что Маше нужна помощь», «Вот великодушие — ты порадовался за другую команду». Это и есть воспитание в действии.</w:t>
+      </w:r>
+    </w:p>
+    <w:p>
+      <w:pPr>
+        <w:spacing w:after="120" w:line="276"/>
+      </w:pPr>
+      <w:r>
+        <w:rPr>
+          <w:rFonts w:ascii="Arial" w:cs="Arial" w:eastAsia="Arial" w:hAnsi="Arial"/>
+          <w:sz w:val="21"/>
+          <w:szCs w:val="21"/>
+        </w:rPr>
+        <w:t xml:space="preserve">Итоговое осмысление чувств, Точка Б и «Праздник успехов» относятся к этапу 8 «Воодушевление».</w:t>
+      </w:r>
+    </w:p>
+    <w:p>
+      <w:pPr>
+        <w:pStyle w:val="Heading2"/>
+        <w:spacing w:after="120" w:before="280"/>
+      </w:pPr>
+      <w:r>
+        <w:rPr>
+          <w:rFonts w:ascii="Arial" w:cs="Arial" w:eastAsia="Arial" w:hAnsi="Arial"/>
+          <w:b/>
+          <w:bCs/>
+          <w:sz w:val="24"/>
+          <w:szCs w:val="24"/>
+        </w:rPr>
+        <w:t>5.8. ЭТАП 8: ВООДУШЕВЛЕНИЕ — ПРАЗДНИК УСПЕХОВ (после общего дела, 30 мин)</w:t>
+      </w:r>
+    </w:p>
+    <w:p>
+      <w:pPr>
+        <w:spacing w:after="120" w:line="276"/>
+      </w:pPr>
+      <w:r>
+        <w:t>Корабль возвращается.</w:t>
       </w:r>
     </w:p>
     <w:p>
@@ -11376,273 +11756,14 @@
           <w:sz w:val="21"/>
           <w:szCs w:val="21"/>
         </w:rPr>
-        <w:t xml:space="preserve">Формула этапа: Общее дело → Метафора («корабль возвращается», «лучик в ладошках») → Активность («Цветок чувств», «Сад», Аллея рекордов) → Самодиагностика «Точка Б» → Трюизм → Мостик в будущее («Семена радости»).</w:t>
+        <w:t xml:space="preserve">Формула этапа: Итоги общего дела → Метафора («корабль возвращается», «лучик в ладошках») → Активность («Цветок чувств», «Сад», Аллея рекордов) → Самодиагностика «Точка Б» → Трюизм → Мостик в будущее («Семена радости»).</w:t>
       </w:r>
     </w:p>
     <w:p>
       <w:pPr>
-        <w:spacing w:after="120" w:line="276"/>
-      </w:pPr>
-      <w:r>
-        <w:rPr>
-          <w:rFonts w:ascii="Arial" w:cs="Arial" w:eastAsia="Arial" w:hAnsi="Arial"/>
-          <w:sz w:val="21"/>
-          <w:szCs w:val="21"/>
-        </w:rPr>
-        <w:t xml:space="preserve">Перед этапом — общее дело класса (1–2 недели после киноурока):</w:t>
-      </w:r>
-    </w:p>
-    <w:tbl>
-      <w:tblPr>
-        <w:tblW w:type="dxa" w:w="9638"/>
-        <w:tblBorders>
-          <w:top w:val="single" w:color="9FB0C3" w:sz="4"/>
-          <w:left w:val="single" w:color="9FB0C3" w:sz="4"/>
-          <w:bottom w:val="single" w:color="9FB0C3" w:sz="4"/>
-          <w:right w:val="single" w:color="9FB0C3" w:sz="4"/>
-          <w:insideH w:val="single" w:color="C9D3DE" w:sz="4"/>
-          <w:insideV w:val="single" w:color="C9D3DE" w:sz="4"/>
-        </w:tblBorders>
-      </w:tblPr>
-      <w:tblGrid>
-        <w:gridCol w:w="3277"/>
-        <w:gridCol w:w="6361"/>
-      </w:tblGrid>
-      <w:tr>
-        <w:trPr>
-          <w:tblHeader/>
-        </w:trPr>
-        <w:tc>
-          <w:tcPr>
-            <w:tcW w:type="dxa" w:w="3277"/>
-            <w:shd w:fill="DCE3EC" w:color="auto" w:val="clear"/>
-            <w:tcMar>
-              <w:top w:type="dxa" w:w="60"/>
-              <w:left w:type="dxa" w:w="90"/>
-              <w:bottom w:type="dxa" w:w="60"/>
-              <w:right w:type="dxa" w:w="90"/>
-            </w:tcMar>
-          </w:tcPr>
-          <w:p>
-            <w:pPr>
-              <w:spacing w:after="0" w:line="259"/>
-            </w:pPr>
-            <w:r>
-              <w:rPr>
-                <w:rFonts w:ascii="Arial" w:cs="Arial" w:eastAsia="Arial" w:hAnsi="Arial"/>
-                <w:b/>
-                <w:bCs/>
-                <w:sz w:val="19"/>
-                <w:szCs w:val="19"/>
-              </w:rPr>
-              <w:t xml:space="preserve">Шаг</w:t>
-            </w:r>
-          </w:p>
-        </w:tc>
-        <w:tc>
-          <w:tcPr>
-            <w:tcW w:type="dxa" w:w="6361"/>
-            <w:shd w:fill="DCE3EC" w:color="auto" w:val="clear"/>
-            <w:tcMar>
-              <w:top w:type="dxa" w:w="60"/>
-              <w:left w:type="dxa" w:w="90"/>
-              <w:bottom w:type="dxa" w:w="60"/>
-              <w:right w:type="dxa" w:w="90"/>
-            </w:tcMar>
-          </w:tcPr>
-          <w:p>
-            <w:pPr>
-              <w:spacing w:after="0" w:line="259"/>
-            </w:pPr>
-            <w:r>
-              <w:rPr>
-                <w:rFonts w:ascii="Arial" w:cs="Arial" w:eastAsia="Arial" w:hAnsi="Arial"/>
-                <w:b/>
-                <w:bCs/>
-                <w:sz w:val="19"/>
-                <w:szCs w:val="19"/>
-              </w:rPr>
-              <w:t xml:space="preserve">Содержание</w:t>
-            </w:r>
-          </w:p>
-        </w:tc>
-      </w:tr>
-      <w:tr>
-        <w:trPr>
-          <w:tblHeader w:val="false"/>
-        </w:trPr>
-        <w:tc>
-          <w:tcPr>
-            <w:tcW w:type="dxa" w:w="3277"/>
-            <w:tcMar>
-              <w:top w:type="dxa" w:w="60"/>
-              <w:left w:type="dxa" w:w="90"/>
-              <w:bottom w:type="dxa" w:w="60"/>
-              <w:right w:type="dxa" w:w="90"/>
-            </w:tcMar>
-          </w:tcPr>
-          <w:p>
-            <w:pPr>
-              <w:spacing w:after="0" w:line="259"/>
-            </w:pPr>
-            <w:r>
-              <w:rPr>
-                <w:rFonts w:ascii="Arial" w:cs="Arial" w:eastAsia="Arial" w:hAnsi="Arial"/>
-                <w:b w:val="false"/>
-                <w:bCs w:val="false"/>
-                <w:sz w:val="19"/>
-                <w:szCs w:val="19"/>
-              </w:rPr>
-              <w:t xml:space="preserve">Подготовка</w:t>
-            </w:r>
-          </w:p>
-        </w:tc>
-        <w:tc>
-          <w:tcPr>
-            <w:tcW w:type="dxa" w:w="6361"/>
-            <w:tcMar>
-              <w:top w:type="dxa" w:w="60"/>
-              <w:left w:type="dxa" w:w="90"/>
-              <w:bottom w:type="dxa" w:w="60"/>
-              <w:right w:type="dxa" w:w="90"/>
-            </w:tcMar>
-          </w:tcPr>
-          <w:p>
-            <w:pPr>
-              <w:spacing w:after="0" w:line="259"/>
-            </w:pPr>
-            <w:r>
-              <w:rPr>
-                <w:rFonts w:ascii="Arial" w:cs="Arial" w:eastAsia="Arial" w:hAnsi="Arial"/>
-                <w:b w:val="false"/>
-                <w:bCs w:val="false"/>
-                <w:sz w:val="19"/>
-                <w:szCs w:val="19"/>
-              </w:rPr>
-              <w:t xml:space="preserve">Проверка Паспорта общего дела: получатель, потребность, роли, материалы, помощь взрослых, срок</w:t>
-            </w:r>
-          </w:p>
-        </w:tc>
-      </w:tr>
-      <w:tr>
-        <w:trPr>
-          <w:tblHeader w:val="false"/>
-        </w:trPr>
-        <w:tc>
-          <w:tcPr>
-            <w:tcW w:type="dxa" w:w="3277"/>
-            <w:tcMar>
-              <w:top w:type="dxa" w:w="60"/>
-              <w:left w:type="dxa" w:w="90"/>
-              <w:bottom w:type="dxa" w:w="60"/>
-              <w:right w:type="dxa" w:w="90"/>
-            </w:tcMar>
-          </w:tcPr>
-          <w:p>
-            <w:pPr>
-              <w:spacing w:after="0" w:line="259"/>
-            </w:pPr>
-            <w:r>
-              <w:rPr>
-                <w:rFonts w:ascii="Arial" w:cs="Arial" w:eastAsia="Arial" w:hAnsi="Arial"/>
-                <w:b w:val="false"/>
-                <w:bCs w:val="false"/>
-                <w:sz w:val="19"/>
-                <w:szCs w:val="19"/>
-              </w:rPr>
-              <w:t xml:space="preserve">Выполнение</w:t>
-            </w:r>
-          </w:p>
-        </w:tc>
-        <w:tc>
-          <w:tcPr>
-            <w:tcW w:type="dxa" w:w="6361"/>
-            <w:tcMar>
-              <w:top w:type="dxa" w:w="60"/>
-              <w:left w:type="dxa" w:w="90"/>
-              <w:bottom w:type="dxa" w:w="60"/>
-              <w:right w:type="dxa" w:w="90"/>
-            </w:tcMar>
-          </w:tcPr>
-          <w:p>
-            <w:pPr>
-              <w:spacing w:after="0" w:line="259"/>
-            </w:pPr>
-            <w:r>
-              <w:rPr>
-                <w:rFonts w:ascii="Arial" w:cs="Arial" w:eastAsia="Arial" w:hAnsi="Arial"/>
-                <w:b w:val="false"/>
-                <w:bCs w:val="false"/>
-                <w:sz w:val="19"/>
-                <w:szCs w:val="19"/>
-              </w:rPr>
-              <w:t xml:space="preserve">Каждая команда делает свою часть; педагог называет вслух проявления трёх парусов</w:t>
-            </w:r>
-          </w:p>
-        </w:tc>
-      </w:tr>
-      <w:tr>
-        <w:trPr>
-          <w:tblHeader w:val="false"/>
-        </w:trPr>
-        <w:tc>
-          <w:tcPr>
-            <w:tcW w:type="dxa" w:w="3277"/>
-            <w:tcMar>
-              <w:top w:type="dxa" w:w="60"/>
-              <w:left w:type="dxa" w:w="90"/>
-              <w:bottom w:type="dxa" w:w="60"/>
-              <w:right w:type="dxa" w:w="90"/>
-            </w:tcMar>
-          </w:tcPr>
-          <w:p>
-            <w:pPr>
-              <w:spacing w:after="0" w:line="259"/>
-            </w:pPr>
-            <w:r>
-              <w:rPr>
-                <w:rFonts w:ascii="Arial" w:cs="Arial" w:eastAsia="Arial" w:hAnsi="Arial"/>
-                <w:b w:val="false"/>
-                <w:bCs w:val="false"/>
-                <w:sz w:val="19"/>
-                <w:szCs w:val="19"/>
-              </w:rPr>
-              <w:t xml:space="preserve">Результат для получателя</w:t>
-            </w:r>
-          </w:p>
-        </w:tc>
-        <w:tc>
-          <w:tcPr>
-            <w:tcW w:type="dxa" w:w="6361"/>
-            <w:tcMar>
-              <w:top w:type="dxa" w:w="60"/>
-              <w:left w:type="dxa" w:w="90"/>
-              <w:bottom w:type="dxa" w:w="60"/>
-              <w:right w:type="dxa" w:w="90"/>
-            </w:tcMar>
-          </w:tcPr>
-          <w:p>
-            <w:pPr>
-              <w:spacing w:after="0" w:line="259"/>
-            </w:pPr>
-            <w:r>
-              <w:rPr>
-                <w:rFonts w:ascii="Arial" w:cs="Arial" w:eastAsia="Arial" w:hAnsi="Arial"/>
-                <w:b w:val="false"/>
-                <w:bCs w:val="false"/>
-                <w:sz w:val="19"/>
-                <w:szCs w:val="19"/>
-              </w:rPr>
-              <w:t xml:space="preserve">Класс передаёт результат получателю и видит его реакцию — плод дела</w:t>
-            </w:r>
-          </w:p>
-        </w:tc>
-      </w:tr>
-    </w:tbl>
-    <w:p>
-      <w:pPr>
         <w:spacing w:after="80"/>
       </w:pPr>
+      <w:r/>
     </w:p>
     <w:p>
       <w:pPr>
@@ -16821,7 +16942,7 @@
                 <w:sz w:val="19"/>
                 <w:szCs w:val="19"/>
               </w:rPr>
-              <w:t xml:space="preserve">Тетрадь: задания 6 (корабль), 8 (мандарин и лимон), «Два берега»; карточки чувств и мыслей</w:t>
+              <w:t xml:space="preserve">Тетрадь: задания 6 (корабль), 8 (мандарин и лимон)</w:t>
             </w:r>
           </w:p>
         </w:tc>
@@ -16966,7 +17087,7 @@
                 <w:sz w:val="19"/>
                 <w:szCs w:val="19"/>
               </w:rPr>
-              <w:t xml:space="preserve">Воодушевление</w:t>
+              <w:t>Социальная практика</w:t>
             </w:r>
           </w:p>
         </w:tc>
@@ -16992,7 +17113,64 @@
                 <w:sz w:val="19"/>
                 <w:szCs w:val="19"/>
               </w:rPr>
-              <w:t xml:space="preserve">Материалы дела; тетрадь: задание 9 (цветок), сад; карточки рекордов; сертификат; мандарины</w:t>
+              <w:t>Материалы выбранного общего дела; тетрадь: страница этапа 7</w:t>
+            </w:r>
+          </w:p>
+        </w:tc>
+      </w:tr>
+      <w:tr>
+        <w:trPr>
+          <w:tblHeader w:val="false"/>
+        </w:trPr>
+        <w:tc>
+          <w:tcPr>
+            <w:tcW w:type="dxa" w:w="2313"/>
+            <w:tcMar>
+              <w:top w:type="dxa" w:w="60"/>
+              <w:left w:type="dxa" w:w="90"/>
+              <w:bottom w:type="dxa" w:w="60"/>
+              <w:right w:type="dxa" w:w="90"/>
+            </w:tcMar>
+          </w:tcPr>
+          <w:p>
+            <w:pPr>
+              <w:spacing w:after="0" w:line="259"/>
+            </w:pPr>
+            <w:r>
+              <w:rPr>
+                <w:rFonts w:ascii="Arial" w:cs="Arial" w:eastAsia="Arial" w:hAnsi="Arial"/>
+                <w:b w:val="false"/>
+                <w:bCs w:val="false"/>
+                <w:sz w:val="19"/>
+                <w:szCs w:val="19"/>
+              </w:rPr>
+              <w:t>Воодушевление</w:t>
+            </w:r>
+          </w:p>
+        </w:tc>
+        <w:tc>
+          <w:tcPr>
+            <w:tcW w:type="dxa" w:w="7325"/>
+            <w:tcMar>
+              <w:top w:type="dxa" w:w="60"/>
+              <w:left w:type="dxa" w:w="90"/>
+              <w:bottom w:type="dxa" w:w="60"/>
+              <w:right w:type="dxa" w:w="90"/>
+            </w:tcMar>
+          </w:tcPr>
+          <w:p>
+            <w:pPr>
+              <w:spacing w:after="0" w:line="259"/>
+            </w:pPr>
+            <w:r>
+              <w:rPr>
+                <w:rFonts w:ascii="Arial" w:cs="Arial" w:eastAsia="Arial" w:hAnsi="Arial"/>
+                <w:b w:val="false"/>
+                <w:bCs w:val="false"/>
+                <w:sz w:val="19"/>
+                <w:szCs w:val="19"/>
+              </w:rPr>
+              <w:t>Тетрадь: задание 9 (цветок), сад; карточки рекордов; сертификат; мандарины</w:t>
             </w:r>
           </w:p>
         </w:tc>
@@ -17219,7 +17397,7 @@
                 <w:sz w:val="19"/>
                 <w:szCs w:val="19"/>
               </w:rPr>
-              <w:t xml:space="preserve">7 этапов с единой метафорой и диагностикой; седьмой — после реального дела</w:t>
+              <w:t>8 этапов с единой метафорой и диагностикой; шесть — в день киноурока, седьмой — реальное общее дело, восьмой — после дела</w:t>
             </w:r>
           </w:p>
         </w:tc>
@@ -19165,7 +19343,7 @@
                 <w:sz w:val="19"/>
                 <w:szCs w:val="19"/>
               </w:rPr>
-              <w:t xml:space="preserve">Общее дело класса</w:t>
+              <w:t>7. Социальная практика — общее дело класса</w:t>
             </w:r>
           </w:p>
         </w:tc>
@@ -19248,7 +19426,7 @@
                 <w:sz w:val="19"/>
                 <w:szCs w:val="19"/>
               </w:rPr>
-              <w:t xml:space="preserve">Воодушевление — Праздник успехов</w:t>
+              <w:t>8. Воодушевление — Праздник успехов</w:t>
             </w:r>
           </w:p>
         </w:tc>
@@ -19645,7 +19823,7 @@
                 <w:sz w:val="19"/>
                 <w:szCs w:val="19"/>
               </w:rPr>
-              <w:t xml:space="preserve">4 занятия</w:t>
+              <w:t xml:space="preserve">4 занятия + общее дело</w:t>
             </w:r>
           </w:p>
         </w:tc>
@@ -19671,7 +19849,7 @@
                 <w:sz w:val="19"/>
                 <w:szCs w:val="19"/>
               </w:rPr>
-              <w:t xml:space="preserve">Впечатление (этапы 1–3), Осмысление (этапы 4–5), Применение (этап 6), Праздник успехов после дела (этап 7)</w:t>
+              <w:t xml:space="preserve">Впечатление (этапы 1–3), Осмысление (этапы 4–5), Применение (этап 6); затем общее дело — Социальная практика (этап 7); после дела — Праздник успехов (этап 8)</w:t>
             </w:r>
           </w:p>
         </w:tc>
@@ -20474,7 +20652,7 @@
           <w:sz w:val="21"/>
           <w:szCs w:val="21"/>
         </w:rPr>
-        <w:t xml:space="preserve">Назначить дату общего дела и дату «Праздника успехов» (этап 7 «Воодушевление»)</w:t>
+        <w:t>Назначить дату общего дела и дату «Праздника успехов» (этап 8 «Воодушевление»)</w:t>
       </w:r>
     </w:p>
     <w:p>
@@ -20615,6 +20793,19 @@
           <w:sz w:val="21"/>
           <w:szCs w:val="21"/>
         </w:rPr>
+        <w:t xml:space="preserve">Этап «Социальная практика»: Класс выполняет выбранное общее дело. Спросите ребёнка: «Какая у тебя роль в нашем деле и кому оно принесёт радость?» Если делу нужна помощь взрослых — мы будем рады.</w:t>
+      </w:r>
+    </w:p>
+    <w:p>
+      <w:pPr>
+        <w:spacing w:after="120" w:line="276"/>
+      </w:pPr>
+      <w:r>
+        <w:rPr>
+          <w:rFonts w:ascii="Arial" w:cs="Arial" w:eastAsia="Arial" w:hAnsi="Arial"/>
+          <w:sz w:val="21"/>
+          <w:szCs w:val="21"/>
+        </w:rPr>
         <w:t xml:space="preserve">Этап «Воодушевление»: Наше общее дело выполнено! Сегодня класс праздновал успехи и прошёл Аллею рекордов. Спросите ребёнка: «Какого цвета получился твой цветок и за кого ты радовался в этом деле?»</w:t>
       </w:r>
     </w:p>
@@ -21020,7 +21211,7 @@
                 <w:sz w:val="19"/>
                 <w:szCs w:val="19"/>
               </w:rPr>
-              <w:t xml:space="preserve">Воодушевление</w:t>
+              <w:t>Социальная практика</w:t>
             </w:r>
           </w:p>
         </w:tc>
@@ -21046,7 +21237,7 @@
                 <w:sz w:val="19"/>
                 <w:szCs w:val="19"/>
               </w:rPr>
-              <w:t xml:space="preserve">«Семейный рекорд»: узнать историю, когда кто-то в семье радовался за другого; «Семена радости дома»</w:t>
+              <w:t>Выполнить свою роль в общем деле класса; фактическое действие важнее повторного планирования</w:t>
             </w:r>
           </w:p>
         </w:tc>
@@ -21077,7 +21268,7 @@
                 <w:sz w:val="19"/>
                 <w:szCs w:val="19"/>
               </w:rPr>
-              <w:t xml:space="preserve">Социальная практика</w:t>
+              <w:t>Воодушевление</w:t>
             </w:r>
           </w:p>
         </w:tc>
@@ -21103,7 +21294,7 @@
                 <w:sz w:val="19"/>
                 <w:szCs w:val="19"/>
               </w:rPr>
-              <w:t xml:space="preserve">«Семена радости дома»: рассказать семье, куда посеять семена радости, и придумать первый шаг</w:t>
+              <w:t>«Семейный рекорд»: узнать историю, когда кто-то в семье радовался за другого; «Семена радости дома»</w:t>
             </w:r>
           </w:p>
         </w:tc>
@@ -23963,7 +24154,7 @@
                 <w:sz w:val="19"/>
                 <w:szCs w:val="19"/>
               </w:rPr>
-              <w:t xml:space="preserve">Воодушевление</w:t>
+              <w:t>Социальная практика</w:t>
             </w:r>
           </w:p>
         </w:tc>
@@ -23989,7 +24180,7 @@
                 <w:sz w:val="19"/>
                 <w:szCs w:val="19"/>
               </w:rPr>
-              <w:t xml:space="preserve">Дневник дела; задание 9 «Цветок»; Сад; Мой рекорд — четыре линзы; Точка Б; Семена радости; Сертификат</w:t>
+              <w:t>Дневник фактического участия в деле</w:t>
             </w:r>
           </w:p>
         </w:tc>
@@ -24015,7 +24206,90 @@
                 <w:sz w:val="19"/>
                 <w:szCs w:val="19"/>
               </w:rPr>
-              <w:t xml:space="preserve">Общее дело; Лучик в ладошках; Аллея рекордов; Праздник успехов</w:t>
+              <w:t>Выполнение общего дела класса</w:t>
+            </w:r>
+          </w:p>
+        </w:tc>
+      </w:tr>
+      <w:tr>
+        <w:trPr>
+          <w:tblHeader w:val="false"/>
+        </w:trPr>
+        <w:tc>
+          <w:tcPr>
+            <w:tcW w:type="dxa" w:w="2120"/>
+            <w:tcMar>
+              <w:top w:type="dxa" w:w="60"/>
+              <w:left w:type="dxa" w:w="90"/>
+              <w:bottom w:type="dxa" w:w="60"/>
+              <w:right w:type="dxa" w:w="90"/>
+            </w:tcMar>
+          </w:tcPr>
+          <w:p>
+            <w:pPr>
+              <w:spacing w:after="0" w:line="259"/>
+            </w:pPr>
+            <w:r>
+              <w:rPr>
+                <w:rFonts w:ascii="Arial" w:cs="Arial" w:eastAsia="Arial" w:hAnsi="Arial"/>
+                <w:b w:val="false"/>
+                <w:bCs w:val="false"/>
+                <w:sz w:val="19"/>
+                <w:szCs w:val="19"/>
+              </w:rPr>
+              <w:t>Воодушевление</w:t>
+            </w:r>
+          </w:p>
+        </w:tc>
+        <w:tc>
+          <w:tcPr>
+            <w:tcW w:type="dxa" w:w="3759"/>
+            <w:tcMar>
+              <w:top w:type="dxa" w:w="60"/>
+              <w:left w:type="dxa" w:w="90"/>
+              <w:bottom w:type="dxa" w:w="60"/>
+              <w:right w:type="dxa" w:w="90"/>
+            </w:tcMar>
+          </w:tcPr>
+          <w:p>
+            <w:pPr>
+              <w:spacing w:after="0" w:line="259"/>
+            </w:pPr>
+            <w:r>
+              <w:rPr>
+                <w:rFonts w:ascii="Arial" w:cs="Arial" w:eastAsia="Arial" w:hAnsi="Arial"/>
+                <w:b w:val="false"/>
+                <w:bCs w:val="false"/>
+                <w:sz w:val="19"/>
+                <w:szCs w:val="19"/>
+              </w:rPr>
+              <w:t>Задание 9 «Цветок»; Сад; Мой рекорд — четыре линзы; Точка Б; Семена радости; Сертификат</w:t>
+            </w:r>
+          </w:p>
+        </w:tc>
+        <w:tc>
+          <w:tcPr>
+            <w:tcW w:type="dxa" w:w="3759"/>
+            <w:tcMar>
+              <w:top w:type="dxa" w:w="60"/>
+              <w:left w:type="dxa" w:w="90"/>
+              <w:bottom w:type="dxa" w:w="60"/>
+              <w:right w:type="dxa" w:w="90"/>
+            </w:tcMar>
+          </w:tcPr>
+          <w:p>
+            <w:pPr>
+              <w:spacing w:after="0" w:line="259"/>
+            </w:pPr>
+            <w:r>
+              <w:rPr>
+                <w:rFonts w:ascii="Arial" w:cs="Arial" w:eastAsia="Arial" w:hAnsi="Arial"/>
+                <w:b w:val="false"/>
+                <w:bCs w:val="false"/>
+                <w:sz w:val="19"/>
+                <w:szCs w:val="19"/>
+              </w:rPr>
+              <w:t>Лучик в ладошках; Аллея рекордов; Праздник успехов</w:t>
             </w:r>
           </w:p>
         </w:tc>
@@ -24587,7 +24861,7 @@
           <w:sz w:val="21"/>
           <w:szCs w:val="21"/>
         </w:rPr>
-        <w:t xml:space="preserve">Системность — 7 последовательных этапов с единой метафорой и диагностикой; шесть — в день киноурока, седьмой — после реального дела</w:t>
+        <w:t>Системность — 8 последовательных этапов с единой метафорой и диагностикой; шесть — в день киноурока, седьмой — реальное общее дело, восьмой — после дела</w:t>
       </w:r>
     </w:p>
     <w:p>
@@ -24734,6 +25008,11 @@
     </w:p>
     <w:sectPr>
       <w:footerReference w:type="default" r:id="rId7"/>
+      <w:headerReference w:type="default" r:id="rId9"/>
+      <w:headerReference w:type="first" r:id="rId10"/>
+      <w:footerReference w:type="first" r:id="rId11"/>
+      <w:headerReference w:type="even" r:id="rId12"/>
+      <w:footerReference w:type="even" r:id="rId13"/>
       <w:pgSz w:w="11906" w:h="16838" w:orient="portrait"/>
       <w:pgMar w:top="1134" w:right="1134" w:bottom="1134" w:left="1134" w:header="708" w:footer="708" w:gutter="0"/>
       <w:pgNumType/>
@@ -24815,6 +25094,26 @@
 </w:ftr>
 </file>
 
+<file path=word/footer2.xml><?xml version="1.0" encoding="utf-8"?>
+<w:ftr xmlns:m="http://schemas.openxmlformats.org/officeDocument/2006/math" xmlns:mc="http://schemas.openxmlformats.org/markup-compatibility/2006" xmlns:mo="http://schemas.microsoft.com/office/mac/office/2008/main" xmlns:mv="urn:schemas-microsoft-com:mac:vml" xmlns:o="urn:schemas-microsoft-com:office:office" xmlns:r="http://schemas.openxmlformats.org/officeDocument/2006/relationships" xmlns:v="urn:schemas-microsoft-com:vml" xmlns:w10="urn:schemas-microsoft-com:office:word" xmlns:w14="http://schemas.microsoft.com/office/word/2010/wordml" xmlns:w="http://schemas.openxmlformats.org/wordprocessingml/2006/main" xmlns:wne="http://schemas.microsoft.com/office/word/2006/wordml" xmlns:wp14="http://schemas.microsoft.com/office/word/2010/wordprocessingDrawing" xmlns:wp="http://schemas.openxmlformats.org/drawingml/2006/wordprocessingDrawing" xmlns:wpc="http://schemas.microsoft.com/office/word/2010/wordprocessingCanvas" xmlns:wpg="http://schemas.microsoft.com/office/word/2010/wordprocessingGroup" xmlns:wpi="http://schemas.microsoft.com/office/word/2010/wordprocessingInk" xmlns:wps="http://schemas.microsoft.com/office/word/2010/wordprocessingShape" mc:Ignorable="w14 wp14">
+  <w:p>
+    <w:pPr>
+      <w:pStyle w:val="Footer"/>
+    </w:pPr>
+  </w:p>
+</w:ftr>
+</file>
+
+<file path=word/footer3.xml><?xml version="1.0" encoding="utf-8"?>
+<w:ftr xmlns:m="http://schemas.openxmlformats.org/officeDocument/2006/math" xmlns:mc="http://schemas.openxmlformats.org/markup-compatibility/2006" xmlns:mo="http://schemas.microsoft.com/office/mac/office/2008/main" xmlns:mv="urn:schemas-microsoft-com:mac:vml" xmlns:o="urn:schemas-microsoft-com:office:office" xmlns:r="http://schemas.openxmlformats.org/officeDocument/2006/relationships" xmlns:v="urn:schemas-microsoft-com:vml" xmlns:w10="urn:schemas-microsoft-com:office:word" xmlns:w14="http://schemas.microsoft.com/office/word/2010/wordml" xmlns:w="http://schemas.openxmlformats.org/wordprocessingml/2006/main" xmlns:wne="http://schemas.microsoft.com/office/word/2006/wordml" xmlns:wp14="http://schemas.microsoft.com/office/word/2010/wordprocessingDrawing" xmlns:wp="http://schemas.openxmlformats.org/drawingml/2006/wordprocessingDrawing" xmlns:wpc="http://schemas.microsoft.com/office/word/2010/wordprocessingCanvas" xmlns:wpg="http://schemas.microsoft.com/office/word/2010/wordprocessingGroup" xmlns:wpi="http://schemas.microsoft.com/office/word/2010/wordprocessingInk" xmlns:wps="http://schemas.microsoft.com/office/word/2010/wordprocessingShape" mc:Ignorable="w14 wp14">
+  <w:p>
+    <w:pPr>
+      <w:pStyle w:val="Footer"/>
+    </w:pPr>
+  </w:p>
+</w:ftr>
+</file>
+
 <file path=word/footnotes.xml><?xml version="1.0" encoding="utf-8"?>
 <w:footnotes xmlns:wpc="http://schemas.microsoft.com/office/word/2010/wordprocessingCanvas" xmlns:mc="http://schemas.openxmlformats.org/markup-compatibility/2006" xmlns:o="urn:schemas-microsoft-com:office:office" xmlns:r="http://schemas.openxmlformats.org/officeDocument/2006/relationships" xmlns:m="http://schemas.openxmlformats.org/officeDocument/2006/math" xmlns:v="urn:schemas-microsoft-com:vml" xmlns:wp14="http://schemas.microsoft.com/office/word/2010/wordprocessingDrawing" xmlns:wp="http://schemas.openxmlformats.org/drawingml/2006/wordprocessingDrawing" xmlns:w10="urn:schemas-microsoft-com:office:word" xmlns:w="http://schemas.openxmlformats.org/wordprocessingml/2006/main" xmlns:w14="http://schemas.microsoft.com/office/word/2010/wordml" xmlns:w15="http://schemas.microsoft.com/office/word/2012/wordml" xmlns:wpg="http://schemas.microsoft.com/office/word/2010/wordprocessingGroup" xmlns:wpi="http://schemas.microsoft.com/office/word/2010/wordprocessingInk" xmlns:wne="http://schemas.microsoft.com/office/word/2006/wordml" xmlns:wps="http://schemas.microsoft.com/office/word/2010/wordprocessingShape" mc:Ignorable="w14 w15 wp14">
   <w:footnote w:type="separator" w:id="-1">
@@ -24850,6 +25149,36 @@
     </w:p>
   </w:footnote>
 </w:footnotes>
+</file>
+
+<file path=word/header1.xml><?xml version="1.0" encoding="utf-8"?>
+<w:hdr xmlns:m="http://schemas.openxmlformats.org/officeDocument/2006/math" xmlns:mc="http://schemas.openxmlformats.org/markup-compatibility/2006" xmlns:mo="http://schemas.microsoft.com/office/mac/office/2008/main" xmlns:mv="urn:schemas-microsoft-com:mac:vml" xmlns:o="urn:schemas-microsoft-com:office:office" xmlns:r="http://schemas.openxmlformats.org/officeDocument/2006/relationships" xmlns:v="urn:schemas-microsoft-com:vml" xmlns:w10="urn:schemas-microsoft-com:office:word" xmlns:w14="http://schemas.microsoft.com/office/word/2010/wordml" xmlns:w="http://schemas.openxmlformats.org/wordprocessingml/2006/main" xmlns:wne="http://schemas.microsoft.com/office/word/2006/wordml" xmlns:wp14="http://schemas.microsoft.com/office/word/2010/wordprocessingDrawing" xmlns:wp="http://schemas.openxmlformats.org/drawingml/2006/wordprocessingDrawing" xmlns:wpc="http://schemas.microsoft.com/office/word/2010/wordprocessingCanvas" xmlns:wpg="http://schemas.microsoft.com/office/word/2010/wordprocessingGroup" xmlns:wpi="http://schemas.microsoft.com/office/word/2010/wordprocessingInk" xmlns:wps="http://schemas.microsoft.com/office/word/2010/wordprocessingShape" mc:Ignorable="w14 wp14">
+  <w:p>
+    <w:pPr>
+      <w:pStyle w:val="Header"/>
+    </w:pPr>
+  </w:p>
+</w:hdr>
+</file>
+
+<file path=word/header2.xml><?xml version="1.0" encoding="utf-8"?>
+<w:hdr xmlns:m="http://schemas.openxmlformats.org/officeDocument/2006/math" xmlns:mc="http://schemas.openxmlformats.org/markup-compatibility/2006" xmlns:mo="http://schemas.microsoft.com/office/mac/office/2008/main" xmlns:mv="urn:schemas-microsoft-com:mac:vml" xmlns:o="urn:schemas-microsoft-com:office:office" xmlns:r="http://schemas.openxmlformats.org/officeDocument/2006/relationships" xmlns:v="urn:schemas-microsoft-com:vml" xmlns:w10="urn:schemas-microsoft-com:office:word" xmlns:w14="http://schemas.microsoft.com/office/word/2010/wordml" xmlns:w="http://schemas.openxmlformats.org/wordprocessingml/2006/main" xmlns:wne="http://schemas.microsoft.com/office/word/2006/wordml" xmlns:wp14="http://schemas.microsoft.com/office/word/2010/wordprocessingDrawing" xmlns:wp="http://schemas.openxmlformats.org/drawingml/2006/wordprocessingDrawing" xmlns:wpc="http://schemas.microsoft.com/office/word/2010/wordprocessingCanvas" xmlns:wpg="http://schemas.microsoft.com/office/word/2010/wordprocessingGroup" xmlns:wpi="http://schemas.microsoft.com/office/word/2010/wordprocessingInk" xmlns:wps="http://schemas.microsoft.com/office/word/2010/wordprocessingShape" mc:Ignorable="w14 wp14">
+  <w:p>
+    <w:pPr>
+      <w:pStyle w:val="Header"/>
+    </w:pPr>
+  </w:p>
+</w:hdr>
+</file>
+
+<file path=word/header3.xml><?xml version="1.0" encoding="utf-8"?>
+<w:hdr xmlns:m="http://schemas.openxmlformats.org/officeDocument/2006/math" xmlns:mc="http://schemas.openxmlformats.org/markup-compatibility/2006" xmlns:mo="http://schemas.microsoft.com/office/mac/office/2008/main" xmlns:mv="urn:schemas-microsoft-com:mac:vml" xmlns:o="urn:schemas-microsoft-com:office:office" xmlns:r="http://schemas.openxmlformats.org/officeDocument/2006/relationships" xmlns:v="urn:schemas-microsoft-com:vml" xmlns:w10="urn:schemas-microsoft-com:office:word" xmlns:w14="http://schemas.microsoft.com/office/word/2010/wordml" xmlns:w="http://schemas.openxmlformats.org/wordprocessingml/2006/main" xmlns:wne="http://schemas.microsoft.com/office/word/2006/wordml" xmlns:wp14="http://schemas.microsoft.com/office/word/2010/wordprocessingDrawing" xmlns:wp="http://schemas.openxmlformats.org/drawingml/2006/wordprocessingDrawing" xmlns:wpc="http://schemas.microsoft.com/office/word/2010/wordprocessingCanvas" xmlns:wpg="http://schemas.microsoft.com/office/word/2010/wordprocessingGroup" xmlns:wpi="http://schemas.microsoft.com/office/word/2010/wordprocessingInk" xmlns:wps="http://schemas.microsoft.com/office/word/2010/wordprocessingShape" mc:Ignorable="w14 wp14">
+  <w:p>
+    <w:pPr>
+      <w:pStyle w:val="Header"/>
+    </w:pPr>
+  </w:p>
+</w:hdr>
 </file>
 
 <file path=word/numbering.xml><?xml version="1.0" encoding="utf-8"?>

</xml_diff>